<commit_message>
Correção do erro de reversão de arquivo main.
</commit_message>
<xml_diff>
--- a/Requisitos/Documentos de Casos de Uso/CSU11-Manter Usuários.docx
+++ b/Requisitos/Documentos de Casos de Uso/CSU11-Manter Usuários.docx
@@ -624,7 +624,16 @@
                 <w:sz w:val="28"/>
                 <w:szCs w:val="28"/>
               </w:rPr>
-              <w:t>Sistema exibe tela listando todos os usuários cadastrados na plataforma, com nome, CPF, plano atual e status, além de campo de filtro por nome ou CPF (</w:t>
+              <w:t>Sistema exibe os usuários cadastrados</w:t>
+            </w:r>
+            <w:r>
+              <w:rPr>
+                <w:rFonts w:eastAsia="Times New Roman" w:cs="Times New Roman" w:ascii="Times New Roman" w:hAnsi="Times New Roman"/>
+                <w:color w:val="000000"/>
+                <w:sz w:val="28"/>
+                <w:szCs w:val="28"/>
+              </w:rPr>
+              <w:t xml:space="preserve"> (</w:t>
             </w:r>
             <w:r>
               <w:rPr>
@@ -1039,7 +1048,16 @@
                 <w:sz w:val="28"/>
                 <w:szCs w:val="28"/>
               </w:rPr>
-              <w:t>Sistema exibe a tela “Detalhes do Usuário” com os dados cadastrais (nome, data de cadastro, CPF, e-mail, telefone, plano atual) e o status da conta (</w:t>
+              <w:t>Sistema exibe os dados do usuário e seus imóveis anunciados</w:t>
+            </w:r>
+            <w:r>
+              <w:rPr>
+                <w:rFonts w:eastAsia="Times New Roman" w:cs="Times New Roman" w:ascii="Times New Roman" w:hAnsi="Times New Roman"/>
+                <w:color w:val="000000"/>
+                <w:sz w:val="28"/>
+                <w:szCs w:val="28"/>
+              </w:rPr>
+              <w:t xml:space="preserve"> (</w:t>
             </w:r>
             <w:r>
               <w:rPr>
@@ -1107,7 +1125,50 @@
                 <w:sz w:val="28"/>
                 <w:szCs w:val="28"/>
               </w:rPr>
-              <w:t>Ator pressiona o ícone de voltar.</w:t>
+              <w:t xml:space="preserve">Ator retorna à listagem de usuários.</w:t>
+            </w:r>
+          </w:p>
+          <w:p>
+            <w:pPr>
+              <w:pStyle w:val="normal1"/>
+              <w:numPr>
+                <w:ilvl w:val="0"/>
+                <w:numId w:val="2"/>
+              </w:numPr>
+              <w:spacing w:lineRule="auto" w:line="240" w:before="0" w:after="80"/>
+              <w:ind w:hanging="360" w:start="360"/>
+              <w:rPr>
+                <w:rFonts w:ascii="Times New Roman" w:hAnsi="Times New Roman" w:eastAsia="Times New Roman" w:cs="Times New Roman"/>
+                <w:sz w:val="28"/>
+                <w:szCs w:val="28"/>
+              </w:rPr>
+            </w:pPr>
+            <w:r>
+              <w:rPr>
+                <w:rFonts w:eastAsia="Times New Roman" w:cs="Times New Roman" w:ascii="Times New Roman" w:hAnsi="Times New Roman"/>
+                <w:color w:val="000000"/>
+                <w:sz w:val="28"/>
+                <w:szCs w:val="28"/>
+              </w:rPr>
+              <w:t xml:space="preserve">Sistema exibe a listagem de usuários (</w:t>
+            </w:r>
+            <w:r>
+              <w:rPr>
+                <w:rFonts w:eastAsia="Times New Roman" w:cs="Times New Roman" w:ascii="Times New Roman" w:hAnsi="Times New Roman"/>
+                <w:color w:val="FF0000"/>
+                <w:sz w:val="28"/>
+                <w:szCs w:val="28"/>
+              </w:rPr>
+              <w:t xml:space="preserve">Tela_014</w:t>
+            </w:r>
+            <w:r>
+              <w:rPr>
+                <w:rFonts w:eastAsia="Times New Roman" w:cs="Times New Roman" w:ascii="Times New Roman" w:hAnsi="Times New Roman"/>
+                <w:color w:val="000000"/>
+                <w:sz w:val="28"/>
+                <w:szCs w:val="28"/>
+              </w:rPr>
+              <w:t xml:space="preserve">).</w:t>
             </w:r>
           </w:p>
         </w:tc>
@@ -1311,7 +1372,16 @@
                 <w:sz w:val="28"/>
                 <w:szCs w:val="28"/>
               </w:rPr>
-              <w:t>Ator pressiona o botão “Bloquear” referente ao usuário desejado, na listagem de usuários (</w:t>
+              <w:t xml:space="preserve">Ator pressiona o botão “Bloquear”</w:t>
+            </w:r>
+            <w:r>
+              <w:rPr>
+                <w:rFonts w:eastAsia="Times New Roman" w:cs="Times New Roman" w:ascii="Times New Roman" w:hAnsi="Times New Roman"/>
+                <w:color w:val="000000"/>
+                <w:sz w:val="28"/>
+                <w:szCs w:val="28"/>
+              </w:rPr>
+              <w:t xml:space="preserve"> na listagem de usuários (</w:t>
             </w:r>
             <w:r>
               <w:rPr>
@@ -1320,7 +1390,7 @@
                 <w:sz w:val="28"/>
                 <w:szCs w:val="28"/>
               </w:rPr>
-              <w:t>Tela_014</w:t>
+              <w:t xml:space="preserve">Tela_014</w:t>
             </w:r>
             <w:r>
               <w:rPr>
@@ -1329,7 +1399,7 @@
                 <w:sz w:val="28"/>
                 <w:szCs w:val="28"/>
               </w:rPr>
-              <w:t>) ou na tela “Detalhes do Usuário” (</w:t>
+              <w:t xml:space="preserve">) ou o botão “Bloquear conta” na tela “Detalhes do Usuário” (</w:t>
             </w:r>
             <w:r>
               <w:rPr>
@@ -1338,7 +1408,7 @@
                 <w:sz w:val="28"/>
                 <w:szCs w:val="28"/>
               </w:rPr>
-              <w:t>Tela_015</w:t>
+              <w:t xml:space="preserve">Tela_015</w:t>
             </w:r>
             <w:r>
               <w:rPr>
@@ -1347,7 +1417,7 @@
                 <w:sz w:val="28"/>
                 <w:szCs w:val="28"/>
               </w:rPr>
-              <w:t>).</w:t>
+              <w:t xml:space="preserve">), referente ao usuário desejado.</w:t>
             </w:r>
           </w:p>
           <w:p>
@@ -1372,7 +1442,7 @@
                 <w:sz w:val="28"/>
                 <w:szCs w:val="28"/>
               </w:rPr>
-              <w:t>Sistema exibe modal de confirmação “Bloquear?”, informando que o usuário não poderá mais acessar a plataforma (</w:t>
+              <w:t>Sistema exibe modal de confirmação “Bloquear conta?”, informando que o usuário não poderá mais acessar a plataforma (</w:t>
             </w:r>
             <w:r>
               <w:rPr>
@@ -1415,7 +1485,16 @@
                 <w:sz w:val="28"/>
                 <w:szCs w:val="28"/>
               </w:rPr>
-              <w:t>Ator pressiona o botão “Bloquear”.</w:t>
+              <w:t xml:space="preserve">Ator pressiona o botão “Bloquear</w:t>
+            </w:r>
+            <w:r>
+              <w:rPr>
+                <w:rFonts w:eastAsia="Times New Roman" w:cs="Times New Roman" w:ascii="Times New Roman" w:hAnsi="Times New Roman"/>
+                <w:color w:val="000000"/>
+                <w:sz w:val="28"/>
+                <w:szCs w:val="28"/>
+              </w:rPr>
+              <w:t xml:space="preserve">”.</w:t>
             </w:r>
           </w:p>
           <w:p>
@@ -2191,6 +2270,7 @@
           <w:tcPr>
             <w:tcW w:w="1799" w:type="dxa"/>
             <w:tcBorders>
+              <w:top w:val="single" w:sz="4" w:space="0" w:color="000000"/>
               <w:start w:val="single" w:sz="4" w:space="0" w:color="000000"/>
               <w:bottom w:val="single" w:sz="4" w:space="0" w:color="000000"/>
               <w:end w:val="single" w:sz="4" w:space="0" w:color="000000"/>
@@ -2214,12 +2294,39 @@
               </w:rPr>
               <w:t>14/10/2026</w:t>
             </w:r>
+            <w:r>
+              <w:rPr>
+                <w:rFonts w:eastAsia="Times New Roman" w:cs="Times New Roman" w:ascii="Times New Roman" w:hAnsi="Times New Roman"/>
+                <w:color w:val="000000"/>
+                <w:sz w:val="24"/>
+                <w:szCs w:val="24"/>
+              </w:rPr>
+              <w:t/>
+            </w:r>
+            <w:r>
+              <w:rPr>
+                <w:rFonts w:eastAsia="Times New Roman" w:cs="Times New Roman" w:ascii="Times New Roman" w:hAnsi="Times New Roman"/>
+                <w:sz w:val="24"/>
+                <w:szCs w:val="24"/>
+              </w:rPr>
+              <w:t/>
+            </w:r>
+            <w:r>
+              <w:rPr>
+                <w:rFonts w:eastAsia="Times New Roman" w:cs="Times New Roman" w:ascii="Times New Roman" w:hAnsi="Times New Roman"/>
+                <w:color w:val="000000"/>
+                <w:sz w:val="24"/>
+                <w:szCs w:val="24"/>
+              </w:rPr>
+              <w:t/>
+            </w:r>
           </w:p>
         </w:tc>
         <w:tc>
           <w:tcPr>
             <w:tcW w:w="2600" w:type="dxa"/>
             <w:tcBorders>
+              <w:top w:val="single" w:sz="4" w:space="0" w:color="000000"/>
               <w:start w:val="single" w:sz="4" w:space="0" w:color="000000"/>
               <w:bottom w:val="single" w:sz="4" w:space="0" w:color="000000"/>
               <w:end w:val="single" w:sz="4" w:space="0" w:color="000000"/>
@@ -2238,6 +2345,7 @@
             <w:r>
               <w:rPr>
                 <w:rFonts w:eastAsia="Times New Roman" w:cs="Times New Roman" w:ascii="Times New Roman" w:hAnsi="Times New Roman"/>
+                <w:color w:val="000000"/>
                 <w:sz w:val="24"/>
                 <w:szCs w:val="24"/>
               </w:rPr>
@@ -2249,6 +2357,7 @@
           <w:tcPr>
             <w:tcW w:w="5931" w:type="dxa"/>
             <w:tcBorders>
+              <w:top w:val="single" w:sz="4" w:space="0" w:color="000000"/>
               <w:start w:val="single" w:sz="4" w:space="0" w:color="000000"/>
               <w:bottom w:val="single" w:sz="4" w:space="0" w:color="000000"/>
               <w:end w:val="single" w:sz="4" w:space="0" w:color="000000"/>
@@ -2267,6 +2376,7 @@
             <w:r>
               <w:rPr>
                 <w:rFonts w:eastAsia="Times New Roman" w:cs="Times New Roman" w:ascii="Times New Roman" w:hAnsi="Times New Roman"/>
+                <w:color w:val="000000"/>
                 <w:sz w:val="24"/>
                 <w:szCs w:val="24"/>
               </w:rPr>

</xml_diff>